<commit_message>
v53 : secrétaires payées au taux horaire (17 €/h par défaut, négociable) — appli, simulateur, contrat et guide collaborateur
</commit_message>
<xml_diff>
--- a/docs/pack-commercial/CONTRAT-PRESTATION_collaborateur.docx
+++ b/docs/pack-commercial/CONTRAT-PRESTATION_collaborateur.docx
@@ -281,7 +281,7 @@
           <w:sz w:val="20"/>
           <w:szCs w:val="20"/>
         </w:rPr>
-        <w:t xml:space="preserve">Le Prestataire perçoit une rétrocession de 65 % (soixante-cinq pour cent) du chiffre d'affaires hors taxes « secrétariat » effectivement facturé et encaissé par le Donneur d'ordre au titre des garages qui lui sont affectés. La part « abonnement plateforme » n'entre pas dans l'assiette.</w:t>
+        <w:t>Le Prestataire perçoit une rémunération forfaitaire par garage affecté, égale au nombre d'heures du forfait souscrit par ce garage (10, 20 ou 40 heures par mois) multiplié par le taux horaire hors taxes fixé à l'annexe 1 (dix-sept euros à la signature, révisable d'un commun accord par avenant). Elle est due pour chaque mensualité effectivement encaissée par le Donneur d'ordre auprès du garage ; les heures hors forfait validées par le garage sont rémunérées au même taux horaire. Le prix de vente pratiqué par le Donneur d'ordre, et les remises qu'il consent, sont sans incidence sur cette rémunération.</w:t>
       </w:r>
     </w:p>
     <w:p>
@@ -296,7 +296,7 @@
           <w:sz w:val="20"/>
           <w:szCs w:val="20"/>
         </w:rPr>
-        <w:t xml:space="preserve">À titre indicatif à la date de signature : forfait Confort (20 h) facturé 781 € HT hors abonnement, soit une rétrocession de 507,65 € par garage et par mois (≈ 25,40 € / h). Les heures hors forfait facturées 45 € HT sont rétrocédées au même taux de 65 %.</w:t>
+        <w:t>À titre indicatif à la date de signature : forfait Confort (20 h) → 340 € HT par garage et par mois ; forfait Starter (10 h) → 170 € ; forfait Sérénité (40 h) → 680 €.</w:t>
       </w:r>
     </w:p>
     <w:p>
@@ -565,7 +565,7 @@
           <w:sz w:val="20"/>
           <w:szCs w:val="20"/>
         </w:rPr>
-        <w:t xml:space="preserve">Le Prestataire est responsable de la bonne exécution de ses missions. Sa responsabilité est limitée, toutes causes confondues, au montant des rétrocessions perçues au cours des 6 derniers mois. Le Donneur d'ordre reste seul responsable de la plateforme et de la relation contractuelle avec les garages.</w:t>
+        <w:t>Le Prestataire est responsable de la bonne exécution de ses missions. Sa responsabilité est limitée, toutes causes confondues, au montant des rémunérations perçues au cours des 6 derniers mois. Le Donneur d'ordre reste seul responsable de la plateforme et de la relation contractuelle avec les garages.</w:t>
       </w:r>
     </w:p>
     <w:p>

</xml_diff>

<commit_message>
v10.1 : avertissement d'archivage (= suppression), export comptable (classeur 4 onglets + ZIP factures et rapports d'expertise), sauvegarde avec rapports ; suspension pour impayé, lecture seule à la fin du contrat et purge J+90 pilotées depuis l'espace éditeur (cron quotidien) — migration v56
</commit_message>
<xml_diff>
--- a/docs/pack-commercial/CONTRAT-PRESTATION_collaborateur.docx
+++ b/docs/pack-commercial/CONTRAT-PRESTATION_collaborateur.docx
@@ -249,7 +249,7 @@
           <w:sz w:val="20"/>
           <w:szCs w:val="20"/>
         </w:rPr>
-        <w:t xml:space="preserve">Le Donneur d'ordre affecte au Prestataire un ou plusieurs garages clients, d'un commun accord et par écrit (annexe 1 mise à jour). Le Prestataire peut refuser une affectation. Le volume horaire indicatif correspond au forfait souscrit par chaque garage (10 h, 20 h ou 40 h par mois).</w:t>
+        <w:t>Le Donneur d'ordre affecte au Prestataire un ou plusieurs garages clients, d'un commun accord et par écrit (annexe 1 mise à jour). Le Prestataire peut refuser une affectation. Le volume horaire indicatif correspond au forfait souscrit par chaque garage (10 h, 20 h ou 40 h de secrétariat PAR MOIS).</w:t>
       </w:r>
     </w:p>
     <w:p>
@@ -296,7 +296,7 @@
           <w:sz w:val="20"/>
           <w:szCs w:val="20"/>
         </w:rPr>
-        <w:t>À titre indicatif à la date de signature : forfait Confort (20 h) → 340 € HT par garage et par mois ; forfait Starter (10 h) → 170 € ; forfait Sérénité (40 h) → 680 €.</w:t>
+        <w:t>À titre indicatif à la date de signature : forfait Confort (20 h / mois) → 340 € HT par garage et par mois ; forfait Starter (10 h / mois) → 170 € ; forfait Sérénité (40 h / mois) → 680 €.</w:t>
       </w:r>
     </w:p>
     <w:p>

</xml_diff>